<commit_message>
Redesign FMIC HR571 tailored CV
Co-authored-by: arena-agent <297053741+arena-agent@users.noreply.github.com>
</commit_message>
<xml_diff>
--- a/documents/live_market_test_2026-09-30/watch_aeb9c295fd34296adf_medical_officer_tailored_cv.docx
+++ b/documents/live_market_test_2026-09-30/watch_aeb9c295fd34296adf_medical_officer_tailored_cv.docx
@@ -2,491 +2,777 @@
 <file path=word/document.xml><?xml version="1.0" encoding="utf-8"?>
 <w:document xmlns:wpc="http://schemas.microsoft.com/office/word/2010/wordprocessingCanvas" xmlns:mo="http://schemas.microsoft.com/office/mac/office/2008/main" xmlns:mc="http://schemas.openxmlformats.org/markup-compatibility/2006" xmlns:mv="urn:schemas-microsoft-com:mac:vml" xmlns:o="urn:schemas-microsoft-com:office:office" xmlns:r="http://schemas.openxmlformats.org/officeDocument/2006/relationships" xmlns:m="http://schemas.openxmlformats.org/officeDocument/2006/math" xmlns:v="urn:schemas-microsoft-com:vml" xmlns:wp14="http://schemas.microsoft.com/office/word/2010/wordprocessingDrawing" xmlns:wp="http://schemas.openxmlformats.org/drawingml/2006/wordprocessingDrawing" xmlns:w10="urn:schemas-microsoft-com:office:word" xmlns:w="http://schemas.openxmlformats.org/wordprocessingml/2006/main" xmlns:w14="http://schemas.microsoft.com/office/word/2010/wordml" xmlns:wpg="http://schemas.microsoft.com/office/word/2010/wordprocessingGroup" xmlns:wpi="http://schemas.microsoft.com/office/word/2010/wordprocessingInk" xmlns:wne="http://schemas.microsoft.com/office/word/2006/wordml" xmlns:wps="http://schemas.microsoft.com/office/word/2010/wordprocessingShape" mc:Ignorable="w14 wp14">
   <w:body>
+    <w:tbl>
+      <w:tblPr>
+        <w:tblW w:type="auto" w:w="0"/>
+        <w:tblLook w:firstColumn="1" w:firstRow="1" w:lastColumn="0" w:lastRow="0" w:noHBand="0" w:noVBand="1" w:val="04A0"/>
+      </w:tblPr>
+      <w:tblGrid>
+        <w:gridCol w:w="10858"/>
+      </w:tblGrid>
+      <w:tr>
+        <w:tc>
+          <w:tcPr>
+            <w:tcW w:type="dxa" w:w="10858"/>
+            <w:shd w:fill="0B2D42"/>
+            <w:tcBorders>
+              <w:top w:val="single" w:sz="4" w:color="0B2D42"/>
+              <w:left w:val="single" w:sz="4" w:color="0B2D42"/>
+              <w:bottom w:val="single" w:sz="4" w:color="0B2D42"/>
+              <w:right w:val="single" w:sz="4" w:color="0B2D42"/>
+            </w:tcBorders>
+          </w:tcPr>
+          <w:p/>
+          <w:p>
+            <w:pPr>
+              <w:pStyle w:val="Head"/>
+              <w:jc w:val="center"/>
+            </w:pPr>
+            <w:r>
+              <w:t>ALLAH YAR FROTAN</w:t>
+            </w:r>
+          </w:p>
+          <w:p>
+            <w:pPr>
+              <w:pStyle w:val="Sub"/>
+              <w:jc w:val="center"/>
+            </w:pPr>
+            <w:r>
+              <w:t>Medical Doctor | Health &amp; Nutrition Program Coordination</w:t>
+            </w:r>
+          </w:p>
+          <w:p>
+            <w:pPr>
+              <w:pStyle w:val="Sub"/>
+              <w:jc w:val="center"/>
+            </w:pPr>
+            <w:r>
+              <w:t>Kabul, Afghanistan | +93766462006 | alfrotan@gmail.com</w:t>
+            </w:r>
+          </w:p>
+        </w:tc>
+      </w:tr>
+    </w:tbl>
+    <w:tbl>
+      <w:tblPr>
+        <w:tblW w:type="auto" w:w="0"/>
+        <w:tblLook w:firstColumn="1" w:firstRow="1" w:lastColumn="0" w:lastRow="0" w:noHBand="0" w:noVBand="1" w:val="04A0"/>
+      </w:tblPr>
+      <w:tblGrid>
+        <w:gridCol w:w="10858"/>
+      </w:tblGrid>
+      <w:tr>
+        <w:tc>
+          <w:tcPr>
+            <w:tcW w:type="dxa" w:w="10858"/>
+            <w:shd w:fill="F5F8FA"/>
+            <w:tcBorders>
+              <w:top w:val="single" w:sz="4" w:color="DDE8EE"/>
+              <w:left w:val="single" w:sz="4" w:color="DDE8EE"/>
+              <w:bottom w:val="single" w:sz="4" w:color="DDE8EE"/>
+              <w:right w:val="single" w:sz="4" w:color="DDE8EE"/>
+            </w:tcBorders>
+          </w:tcPr>
+          <w:p>
+            <w:pPr>
+              <w:jc w:val="center"/>
+            </w:pPr>
+            <w:r>
+              <w:rPr>
+                <w:b/>
+                <w:color w:val="0F766E"/>
+              </w:rPr>
+              <w:t xml:space="preserve">TARGET ROLE  </w:t>
+            </w:r>
+            <w:r>
+              <w:rPr>
+                <w:b/>
+                <w:color w:val="0B2D42"/>
+              </w:rPr>
+              <w:t>Medical Officer — FMIC/HR/571 | French Medical Institute for Mothers and Children (FMIC), Kabul</w:t>
+            </w:r>
+          </w:p>
+        </w:tc>
+      </w:tr>
+    </w:tbl>
+    <w:tbl>
+      <w:tblPr>
+        <w:tblW w:type="auto" w:w="0"/>
+        <w:tblLook w:firstColumn="1" w:firstRow="1" w:lastColumn="0" w:lastRow="0" w:noHBand="0" w:noVBand="1" w:val="04A0"/>
+      </w:tblPr>
+      <w:tblGrid>
+        <w:gridCol w:w="5429"/>
+        <w:gridCol w:w="5429"/>
+      </w:tblGrid>
+      <w:tr>
+        <w:tc>
+          <w:tcPr>
+            <w:tcW w:type="dxa" w:w="5429"/>
+            <w:shd w:fill="F3F8FA"/>
+            <w:tcBorders>
+              <w:top w:val="single" w:sz="4" w:color="F3F8FA"/>
+              <w:left w:val="single" w:sz="4" w:color="F3F8FA"/>
+              <w:bottom w:val="single" w:sz="4" w:color="F3F8FA"/>
+              <w:right w:val="single" w:sz="4" w:color="F3F8FA"/>
+            </w:tcBorders>
+          </w:tcPr>
+          <w:p/>
+          <w:p>
+            <w:pPr>
+              <w:pStyle w:val="Sec"/>
+            </w:pPr>
+            <w:r>
+              <w:t>CLINICAL &amp; PROFESSIONAL STRENGTHS</w:t>
+            </w:r>
+          </w:p>
+          <w:p>
+            <w:pPr>
+              <w:pStyle w:val="Body"/>
+              <w:ind w:left="202" w:hanging="144"/>
+            </w:pPr>
+            <w:r>
+              <w:t>• Clinical Assessment &amp; Diagnosis</w:t>
+            </w:r>
+          </w:p>
+          <w:p>
+            <w:pPr>
+              <w:pStyle w:val="Body"/>
+              <w:ind w:left="202" w:hanging="144"/>
+            </w:pPr>
+            <w:r>
+              <w:t>• Diagnosis &amp; Treatment</w:t>
+            </w:r>
+          </w:p>
+          <w:p>
+            <w:pPr>
+              <w:pStyle w:val="Body"/>
+              <w:ind w:left="202" w:hanging="144"/>
+            </w:pPr>
+            <w:r>
+              <w:t>• SAM / Inpatient Nutrition Care</w:t>
+            </w:r>
+          </w:p>
+          <w:p>
+            <w:pPr>
+              <w:pStyle w:val="Body"/>
+              <w:ind w:left="202" w:hanging="144"/>
+            </w:pPr>
+            <w:r>
+              <w:t>• Infection Prevention &amp; Control</w:t>
+            </w:r>
+          </w:p>
+          <w:p>
+            <w:pPr>
+              <w:pStyle w:val="Body"/>
+              <w:ind w:left="202" w:hanging="144"/>
+            </w:pPr>
+            <w:r>
+              <w:t>• HMIS / Health Data Quality</w:t>
+            </w:r>
+          </w:p>
+          <w:p>
+            <w:pPr>
+              <w:pStyle w:val="Body"/>
+              <w:ind w:left="202" w:hanging="144"/>
+            </w:pPr>
+            <w:r>
+              <w:t>• Health &amp; Nutrition Supervision</w:t>
+            </w:r>
+          </w:p>
+          <w:p>
+            <w:pPr>
+              <w:pStyle w:val="Body"/>
+              <w:ind w:left="202" w:hanging="144"/>
+            </w:pPr>
+            <w:r>
+              <w:t>• Emergency &amp; Outbreak Response</w:t>
+            </w:r>
+          </w:p>
+          <w:p>
+            <w:pPr>
+              <w:pStyle w:val="Body"/>
+              <w:ind w:left="202" w:hanging="144"/>
+            </w:pPr>
+            <w:r>
+              <w:t>• Stakeholder Coordination</w:t>
+            </w:r>
+          </w:p>
+          <w:p>
+            <w:pPr>
+              <w:pStyle w:val="Sec"/>
+            </w:pPr>
+            <w:r>
+              <w:t>VERIFIED MEDICAL BASIS</w:t>
+            </w:r>
+          </w:p>
+          <w:p>
+            <w:pPr>
+              <w:pStyle w:val="Body"/>
+              <w:ind w:left="202" w:hanging="144"/>
+            </w:pPr>
+            <w:r>
+              <w:t>• MD, Curative Medicine</w:t>
+            </w:r>
+          </w:p>
+          <w:p>
+            <w:pPr>
+              <w:pStyle w:val="Body"/>
+              <w:ind w:left="202" w:hanging="144"/>
+            </w:pPr>
+            <w:r>
+              <w:t>• Medical registration/license</w:t>
+            </w:r>
+          </w:p>
+          <w:p>
+            <w:pPr>
+              <w:pStyle w:val="Body"/>
+              <w:ind w:left="202" w:hanging="144"/>
+            </w:pPr>
+            <w:r>
+              <w:t>• Medical Exit Exam completed</w:t>
+            </w:r>
+          </w:p>
+        </w:tc>
+        <w:tc>
+          <w:tcPr>
+            <w:tcW w:type="dxa" w:w="5429"/>
+            <w:tcBorders>
+              <w:top w:val="single" w:sz="4" w:color="FFFFFF"/>
+              <w:left w:val="single" w:sz="4" w:color="FFFFFF"/>
+              <w:bottom w:val="single" w:sz="4" w:color="FFFFFF"/>
+              <w:right w:val="single" w:sz="4" w:color="FFFFFF"/>
+            </w:tcBorders>
+          </w:tcPr>
+          <w:p/>
+          <w:p>
+            <w:pPr>
+              <w:pStyle w:val="Sec"/>
+            </w:pPr>
+            <w:r>
+              <w:t>PROFESSIONAL PROFILE</w:t>
+            </w:r>
+          </w:p>
+          <w:p>
+            <w:pPr>
+              <w:pStyle w:val="Body"/>
+            </w:pPr>
+            <w:r>
+              <w:t>Medical Doctor with verified MD education, medical professional registration/license, and completed Medical Exit Exam. Verified experience includes SAM clinical care in a Therapeutic Feeding Unit, supervision of mobile health and nutrition teams, HMIS/DHIS2 data quality, infection prevention training, and coordination with Ministry of Public Health and partner stakeholders. Native Dari/Persian speaker with fluent English and intermediate Pashto.</w:t>
+            </w:r>
+          </w:p>
+          <w:p>
+            <w:pPr>
+              <w:pStyle w:val="Sec"/>
+            </w:pPr>
+            <w:r>
+              <w:t>PROFESSIONAL EXPERIENCE</w:t>
+            </w:r>
+          </w:p>
+          <w:p>
+            <w:pPr>
+              <w:pStyle w:val="Meta"/>
+            </w:pPr>
+            <w:r>
+              <w:rPr>
+                <w:b/>
+              </w:rPr>
+              <w:t>Action Against Hunger (ACF-International)</w:t>
+            </w:r>
+          </w:p>
+          <w:p>
+            <w:pPr>
+              <w:pStyle w:val="Role"/>
+            </w:pPr>
+            <w:r>
+              <w:t>TFU Medical Doctor &amp; Safeguarding Focal Point</w:t>
+            </w:r>
+          </w:p>
+          <w:p>
+            <w:pPr>
+              <w:pStyle w:val="Meta"/>
+            </w:pPr>
+            <w:r>
+              <w:t>Sang-e-Takht TFU, Daikundi | May 2023 – Jul 2025</w:t>
+            </w:r>
+          </w:p>
+          <w:p>
+            <w:pPr>
+              <w:pStyle w:val="Body"/>
+              <w:ind w:left="202" w:hanging="144"/>
+            </w:pPr>
+            <w:r>
+              <w:t>• Delivered clinical assessment, diagnosis, treatment, and follow-up care for children with SAM using WHO, IMAM/CMAM, and national clinical protocols.</w:t>
+            </w:r>
+          </w:p>
+          <w:p>
+            <w:pPr>
+              <w:pStyle w:val="Body"/>
+              <w:ind w:left="202" w:hanging="144"/>
+            </w:pPr>
+            <w:r>
+              <w:t>• Maintained accurate HMIS records and supported data quality while serving as Safeguarding Focal Point for PSEA and child protection.</w:t>
+            </w:r>
+          </w:p>
+          <w:p>
+            <w:pPr>
+              <w:pStyle w:val="Meta"/>
+            </w:pPr>
+            <w:r>
+              <w:rPr>
+                <w:b/>
+              </w:rPr>
+              <w:t>Action Against Hunger (ACF-International)</w:t>
+            </w:r>
+          </w:p>
+          <w:p>
+            <w:pPr>
+              <w:pStyle w:val="Role"/>
+            </w:pPr>
+            <w:r>
+              <w:t>Health and Nutrition Supervisor</w:t>
+            </w:r>
+          </w:p>
+          <w:p>
+            <w:pPr>
+              <w:pStyle w:val="Meta"/>
+            </w:pPr>
+            <w:r>
+              <w:t>Gizab &amp; Sang-e-Takht, Daikundi | Feb 2022 – Dec 2022</w:t>
+            </w:r>
+          </w:p>
+          <w:p>
+            <w:pPr>
+              <w:pStyle w:val="Body"/>
+              <w:ind w:left="202" w:hanging="144"/>
+            </w:pPr>
+            <w:r>
+              <w:t>• Supervised mobile health and nutrition teams delivering community-based BPHS/EPHS-related services.</w:t>
+            </w:r>
+          </w:p>
+          <w:p>
+            <w:pPr>
+              <w:pStyle w:val="Body"/>
+              <w:ind w:left="202" w:hanging="144"/>
+            </w:pPr>
+            <w:r>
+              <w:t>• Supported field health and nutrition service delivery with verified IMAM/CMAM program knowledge.</w:t>
+            </w:r>
+          </w:p>
+          <w:p>
+            <w:pPr>
+              <w:pStyle w:val="Meta"/>
+            </w:pPr>
+            <w:r>
+              <w:rPr>
+                <w:b/>
+              </w:rPr>
+              <w:t>Daikundi Provincial Public Health Directorate</w:t>
+            </w:r>
+          </w:p>
+          <w:p>
+            <w:pPr>
+              <w:pStyle w:val="Role"/>
+            </w:pPr>
+            <w:r>
+              <w:t>Medical Doctor / COVID-19 Rapid Response Team Leader</w:t>
+            </w:r>
+          </w:p>
+          <w:p>
+            <w:pPr>
+              <w:pStyle w:val="Meta"/>
+            </w:pPr>
+            <w:r>
+              <w:t>Daikundi, Afghanistan | Oct 2020 – Dec 2020</w:t>
+            </w:r>
+          </w:p>
+          <w:p>
+            <w:pPr>
+              <w:pStyle w:val="Body"/>
+              <w:ind w:left="202" w:hanging="144"/>
+            </w:pPr>
+            <w:r>
+              <w:t>• Coordinated with Ministry of Public Health representatives, provincial health authorities, and partner organizations during the COVID-19 emergency response.</w:t>
+            </w:r>
+          </w:p>
+          <w:p>
+            <w:pPr>
+              <w:pStyle w:val="Sec"/>
+            </w:pPr>
+            <w:r>
+              <w:t>FMIC APPLICATION FOCUS</w:t>
+            </w:r>
+          </w:p>
+          <w:p>
+            <w:pPr>
+              <w:pStyle w:val="Body"/>
+            </w:pPr>
+            <w:r>
+              <w:t>Tailored to Medical Officer vacancy FMIC/HR/571 using verified clinical, infection-prevention, HMIS, and health-program coordination evidence only.</w:t>
+            </w:r>
+          </w:p>
+        </w:tc>
+      </w:tr>
+    </w:tbl>
     <w:p>
-      <w:pPr>
-        <w:spacing w:after="50"/>
-      </w:pPr>
       <w:r>
-        <w:rPr>
-          <w:sz w:val="17"/>
-        </w:rPr>
-        <w:t>ALLAH YAR FROTAN</w:t>
+        <w:br w:type="page"/>
       </w:r>
     </w:p>
-    <w:p>
-      <w:pPr>
-        <w:spacing w:after="50"/>
-      </w:pPr>
-      <w:r>
-        <w:rPr>
-          <w:sz w:val="17"/>
-        </w:rPr>
-        <w:t>Email: alfrotan@gmail.com</w:t>
-      </w:r>
-    </w:p>
-    <w:p>
-      <w:pPr>
-        <w:spacing w:after="50"/>
-      </w:pPr>
-      <w:r>
-        <w:rPr>
-          <w:sz w:val="17"/>
-        </w:rPr>
-        <w:t>Phone: +93766462006</w:t>
-      </w:r>
-    </w:p>
-    <w:p>
-      <w:pPr>
-        <w:spacing w:after="50"/>
-      </w:pPr>
-      <w:r>
-        <w:rPr>
-          <w:sz w:val="17"/>
-        </w:rPr>
-        <w:t>Location: Kabul, Afghanistan</w:t>
-      </w:r>
-    </w:p>
-    <w:p>
-      <w:pPr>
-        <w:spacing w:after="50"/>
-      </w:pPr>
-      <w:r>
-        <w:rPr>
-          <w:sz w:val="17"/>
-        </w:rPr>
-        <w:t>TARGET ROLE: Medical Officer</w:t>
-      </w:r>
-    </w:p>
-    <w:p>
-      <w:pPr>
-        <w:spacing w:after="50"/>
-      </w:pPr>
-      <w:r>
-        <w:rPr>
-          <w:sz w:val="17"/>
-        </w:rPr>
-        <w:t>TARGET ORGANIZATION: French Medical Institute for Mothers and Children (FMIC)</w:t>
-      </w:r>
-    </w:p>
-    <w:p>
-      <w:pPr>
-        <w:spacing w:after="50"/>
-      </w:pPr>
-      <w:r>
-        <w:rPr>
-          <w:sz w:val="17"/>
-        </w:rPr>
-        <w:t>VACANCY LOCATION: Kabul, Afghanistan</w:t>
-      </w:r>
-    </w:p>
-    <w:p>
-      <w:pPr>
-        <w:spacing w:after="50"/>
-      </w:pPr>
-      <w:r>
-        <w:rPr>
-          <w:sz w:val="17"/>
-        </w:rPr>
-        <w:t>PROFESSIONAL SUMMARY</w:t>
-      </w:r>
-    </w:p>
-    <w:p>
-      <w:pPr>
-        <w:spacing w:after="50"/>
-      </w:pPr>
-      <w:r>
-        <w:rPr>
-          <w:sz w:val="17"/>
-        </w:rPr>
-        <w:t>Medical Doctor with Afghanistan health and nutrition field/supervisory experience, tailored for the Medical Officer role at French Medical Institute for Mothers and Children (FMIC). Vacancy focus areas considered for tailoring include quality improvement and patient safety, clinical assessment, diagnosis and treatment, infection prevention and control; the evidence below is limited to verified profile/CV facts.</w:t>
-      </w:r>
-    </w:p>
-    <w:p>
-      <w:pPr>
-        <w:spacing w:after="50"/>
-      </w:pPr>
-      <w:r>
-        <w:rPr>
-          <w:sz w:val="17"/>
-        </w:rPr>
-        <w:t>VACANCY-FIT HIGHLIGHTS</w:t>
-      </w:r>
-    </w:p>
-    <w:p>
-      <w:pPr>
-        <w:spacing w:after="12"/>
-        <w:ind w:left="259" w:hanging="173"/>
-      </w:pPr>
-      <w:r>
-        <w:rPr>
-          <w:sz w:val="17"/>
-        </w:rPr>
-        <w:t>- Delivered clinical assessment, diagnosis, treatment, and follow-up care for children with SAM applying WHO, IMAM/CMAM, and national clinical protocols. (TFU Medical Doctor &amp; Safeguarding Focal Point | Action Against Hunger (ACF-International) | Sang-e-Takht TFU, Daikundi (2023-05 – 2025-07))</w:t>
-      </w:r>
-    </w:p>
-    <w:p>
-      <w:pPr>
-        <w:spacing w:after="12"/>
-        <w:ind w:left="259" w:hanging="173"/>
-      </w:pPr>
-      <w:r>
-        <w:rPr>
-          <w:sz w:val="17"/>
-        </w:rPr>
-        <w:t>- Coordinated with Ministry of Public Health representatives, provincial health authorities, and partner organizations. (Medical Doctor / COVID-19 Rapid Response Team Leader | Daikundi Provincial Public Health Directorate | Daikundi, Afghanistan (2020-10 – 2020-12))</w:t>
-      </w:r>
-    </w:p>
-    <w:p>
-      <w:pPr>
-        <w:spacing w:after="12"/>
-        <w:ind w:left="259" w:hanging="173"/>
-      </w:pPr>
-      <w:r>
-        <w:rPr>
-          <w:sz w:val="17"/>
-        </w:rPr>
-        <w:t>- Supported administrative operations, procurement processes, financial documentation, and program logistics. (Administrative and Finance Officer | Trend for a Better Tomorrow (TBT) – NGO | Afghanistan (2019-05 – 2019-09))</w:t>
-      </w:r>
-    </w:p>
-    <w:p>
-      <w:pPr>
-        <w:spacing w:after="12"/>
-        <w:ind w:left="259" w:hanging="173"/>
-      </w:pPr>
-      <w:r>
-        <w:rPr>
-          <w:sz w:val="17"/>
-        </w:rPr>
-        <w:t>- Supervised mobile health and nutrition teams delivering community-based BPHS/EPHS-related services. (Health and Nutrition Supervisor | Action Against Hunger (ACF-International) | Gizab &amp; Sang-e-Takht, Daikundi (2022-02 – 2022-12))</w:t>
-      </w:r>
-    </w:p>
-    <w:p>
-      <w:pPr>
-        <w:spacing w:after="12"/>
-        <w:ind w:left="259" w:hanging="173"/>
-      </w:pPr>
-      <w:r>
-        <w:rPr>
-          <w:sz w:val="17"/>
-        </w:rPr>
-        <w:t>- Supported communication and coordination between provincial government departments, NGOs, communities, and development partners. (Public Relations &amp; Communications Advisor | Daikundi Governor's Office | Daikundi, Afghanistan (2020-12 – 2021-08))</w:t>
-      </w:r>
-    </w:p>
-    <w:p>
-      <w:pPr>
-        <w:spacing w:after="12"/>
-        <w:ind w:left="259" w:hanging="173"/>
-      </w:pPr>
-      <w:r>
-        <w:rPr>
-          <w:sz w:val="17"/>
-        </w:rPr>
-        <w:t>- Maintained accurate HMIS records and served as Safeguarding Focal Point supporting PSEA and child protection. (TFU Medical Doctor &amp; Safeguarding Focal Point | Action Against Hunger (ACF-International) | Sang-e-Takht TFU, Daikundi (2023-05 – 2025-07))</w:t>
-      </w:r>
-    </w:p>
-    <w:p>
-      <w:pPr>
-        <w:spacing w:after="50"/>
-      </w:pPr>
-      <w:r>
-        <w:rPr>
-          <w:sz w:val="17"/>
-        </w:rPr>
-        <w:t>CORE COMPETENCIES</w:t>
-      </w:r>
-    </w:p>
-    <w:p>
-      <w:pPr>
-        <w:spacing w:after="12"/>
-        <w:ind w:left="259" w:hanging="173"/>
-      </w:pPr>
-      <w:r>
-        <w:rPr>
-          <w:sz w:val="17"/>
-        </w:rPr>
-        <w:t>- Diagnosis and treatment, Provincial &amp; Ministry of Public Health Stakeholder Coordination, Emergency &amp; Outbreak Response (COVID-19), Health &amp; Nutrition Program Supervision, HMIS / DHIS2 Reporting &amp; Data Quality, Clinical assessment, SAM inpatient care</w:t>
-      </w:r>
-    </w:p>
-    <w:p>
-      <w:pPr>
-        <w:spacing w:after="50"/>
-      </w:pPr>
-      <w:r>
-        <w:rPr>
-          <w:sz w:val="17"/>
-        </w:rPr>
-        <w:t>PROFESSIONAL EXPERIENCE</w:t>
-      </w:r>
-    </w:p>
-    <w:p>
-      <w:pPr>
-        <w:spacing w:after="50"/>
-      </w:pPr>
-      <w:r>
-        <w:rPr>
-          <w:sz w:val="17"/>
-        </w:rPr>
-        <w:t>TFU Medical Doctor &amp; Safeguarding Focal Point | Action Against Hunger (ACF-International) | Sang-e-Takht TFU, Daikundi (2023-05 – 2025-07)</w:t>
-      </w:r>
-    </w:p>
-    <w:p>
-      <w:pPr>
-        <w:spacing w:after="12"/>
-        <w:ind w:left="259" w:hanging="173"/>
-      </w:pPr>
-      <w:r>
-        <w:rPr>
-          <w:sz w:val="17"/>
-        </w:rPr>
-        <w:t>- Delivered clinical assessment, diagnosis, treatment, and follow-up care for children with SAM applying WHO, IMAM/CMAM, and national clinical protocols.</w:t>
-      </w:r>
-    </w:p>
-    <w:p>
-      <w:pPr>
-        <w:spacing w:after="50"/>
-      </w:pPr>
-      <w:r>
-        <w:rPr>
-          <w:sz w:val="17"/>
-        </w:rPr>
-        <w:t>Medical Doctor / COVID-19 Rapid Response Team Leader | Daikundi Provincial Public Health Directorate | Daikundi, Afghanistan (2020-10 – 2020-12)</w:t>
-      </w:r>
-    </w:p>
-    <w:p>
-      <w:pPr>
-        <w:spacing w:after="12"/>
-        <w:ind w:left="259" w:hanging="173"/>
-      </w:pPr>
-      <w:r>
-        <w:rPr>
-          <w:sz w:val="17"/>
-        </w:rPr>
-        <w:t>- Coordinated with Ministry of Public Health representatives, provincial health authorities, and partner organizations.</w:t>
-      </w:r>
-    </w:p>
-    <w:p>
-      <w:pPr>
-        <w:spacing w:after="50"/>
-      </w:pPr>
-      <w:r>
-        <w:rPr>
-          <w:sz w:val="17"/>
-        </w:rPr>
-        <w:t>Health and Nutrition Supervisor | Action Against Hunger (ACF-International) | Gizab &amp; Sang-e-Takht, Daikundi (2022-02 – 2022-12)</w:t>
-      </w:r>
-    </w:p>
-    <w:p>
-      <w:pPr>
-        <w:spacing w:after="12"/>
-        <w:ind w:left="259" w:hanging="173"/>
-      </w:pPr>
-      <w:r>
-        <w:rPr>
-          <w:sz w:val="17"/>
-        </w:rPr>
-        <w:t>- Supervised mobile health and nutrition teams delivering community-based BPHS/EPHS-related services.</w:t>
-      </w:r>
-    </w:p>
-    <w:p>
-      <w:pPr>
-        <w:spacing w:after="50"/>
-      </w:pPr>
-      <w:r>
-        <w:rPr>
-          <w:sz w:val="17"/>
-        </w:rPr>
-        <w:t>Public Relations &amp; Communications Advisor | Daikundi Governor's Office | Daikundi, Afghanistan (2020-12 – 2021-08)</w:t>
-      </w:r>
-    </w:p>
-    <w:p>
-      <w:pPr>
-        <w:spacing w:after="12"/>
-        <w:ind w:left="259" w:hanging="173"/>
-      </w:pPr>
-      <w:r>
-        <w:rPr>
-          <w:sz w:val="17"/>
-        </w:rPr>
-        <w:t>- Supported communication and coordination between provincial government departments, NGOs, communities, and development partners.</w:t>
-      </w:r>
-    </w:p>
-    <w:p>
-      <w:pPr>
-        <w:spacing w:after="50"/>
-      </w:pPr>
-      <w:r>
-        <w:rPr>
-          <w:sz w:val="17"/>
-        </w:rPr>
-        <w:t>Administrative and Finance Officer | Trend for a Better Tomorrow (TBT) – NGO | Afghanistan (2019-05 – 2019-09)</w:t>
-      </w:r>
-    </w:p>
-    <w:p>
-      <w:pPr>
-        <w:spacing w:after="12"/>
-        <w:ind w:left="259" w:hanging="173"/>
-      </w:pPr>
-      <w:r>
-        <w:rPr>
-          <w:sz w:val="17"/>
-        </w:rPr>
-        <w:t>- Supported administrative operations, procurement processes, financial documentation, and program logistics.</w:t>
-      </w:r>
-    </w:p>
-    <w:p>
-      <w:pPr>
-        <w:spacing w:after="50"/>
-      </w:pPr>
-      <w:r>
-        <w:rPr>
-          <w:sz w:val="17"/>
-        </w:rPr>
-        <w:t>EDUCATION</w:t>
-      </w:r>
-    </w:p>
-    <w:p>
-      <w:pPr>
-        <w:spacing w:after="12"/>
-        <w:ind w:left="259" w:hanging="173"/>
-      </w:pPr>
-      <w:r>
-        <w:rPr>
-          <w:sz w:val="17"/>
-        </w:rPr>
-        <w:t>- Doctor of Medicine (MD), Curative Medicine — Kabul Medical Science University — 2013 — 2020</w:t>
-      </w:r>
-    </w:p>
-    <w:p>
-      <w:pPr>
-        <w:spacing w:after="50"/>
-      </w:pPr>
-      <w:r>
-        <w:rPr>
-          <w:sz w:val="17"/>
-        </w:rPr>
-        <w:t>LICENSE / REGISTRATION</w:t>
-      </w:r>
-    </w:p>
-    <w:p>
-      <w:pPr>
-        <w:spacing w:after="12"/>
-        <w:ind w:left="259" w:hanging="173"/>
-      </w:pPr>
-      <w:r>
-        <w:rPr>
-          <w:sz w:val="17"/>
-        </w:rPr>
-        <w:t>- Verified — holds valid medical professional registration/license (Afghan Medical Council / medical professional registration)</w:t>
-      </w:r>
-    </w:p>
-    <w:p>
-      <w:pPr>
-        <w:spacing w:after="50"/>
-      </w:pPr>
-      <w:r>
-        <w:rPr>
-          <w:sz w:val="17"/>
-        </w:rPr>
-        <w:t>MEDICAL EXIT EXAM</w:t>
-      </w:r>
-    </w:p>
-    <w:p>
-      <w:pPr>
-        <w:spacing w:after="12"/>
-        <w:ind w:left="259" w:hanging="173"/>
-      </w:pPr>
-      <w:r>
-        <w:rPr>
-          <w:sz w:val="17"/>
-        </w:rPr>
-        <w:t>- Verified — completed the required Medical Exit Exam</w:t>
-      </w:r>
-    </w:p>
-    <w:p>
-      <w:pPr>
-        <w:spacing w:after="50"/>
-      </w:pPr>
-      <w:r>
-        <w:rPr>
-          <w:sz w:val="17"/>
-        </w:rPr>
-        <w:t>CERTIFICATIONS &amp; TRAINING</w:t>
-      </w:r>
-    </w:p>
-    <w:p>
-      <w:pPr>
-        <w:spacing w:after="12"/>
-        <w:ind w:left="259" w:hanging="173"/>
-      </w:pPr>
-      <w:r>
-        <w:rPr>
-          <w:sz w:val="17"/>
-        </w:rPr>
-        <w:t>- Safeguarding &amp; PSEA — ACF (2024)</w:t>
-      </w:r>
-    </w:p>
-    <w:p>
-      <w:pPr>
-        <w:spacing w:after="12"/>
-        <w:ind w:left="259" w:hanging="173"/>
-      </w:pPr>
-      <w:r>
-        <w:rPr>
-          <w:sz w:val="17"/>
-        </w:rPr>
-        <w:t>- Infection Prevention &amp; Control (IPC) — ACF (2023)</w:t>
-      </w:r>
-    </w:p>
-    <w:p>
-      <w:pPr>
-        <w:spacing w:after="12"/>
-        <w:ind w:left="259" w:hanging="173"/>
-      </w:pPr>
-      <w:r>
-        <w:rPr>
-          <w:sz w:val="17"/>
-        </w:rPr>
-        <w:t>- HMIS Reporting &amp; Health Data Management — ACF (2023)</w:t>
-      </w:r>
-    </w:p>
-    <w:p>
-      <w:pPr>
-        <w:spacing w:after="12"/>
-        <w:ind w:left="259" w:hanging="173"/>
-      </w:pPr>
-      <w:r>
-        <w:rPr>
-          <w:sz w:val="17"/>
-        </w:rPr>
-        <w:t>- IMAM, IMNCI, IYCF &amp; Stock Management — ACF (2022)</w:t>
-      </w:r>
-    </w:p>
-    <w:p>
-      <w:pPr>
-        <w:spacing w:after="50"/>
-      </w:pPr>
-      <w:r>
-        <w:rPr>
-          <w:sz w:val="17"/>
-        </w:rPr>
-        <w:t>LANGUAGES</w:t>
-      </w:r>
-    </w:p>
-    <w:p>
-      <w:pPr>
-        <w:spacing w:after="12"/>
-        <w:ind w:left="259" w:hanging="173"/>
-      </w:pPr>
-      <w:r>
-        <w:rPr>
-          <w:sz w:val="17"/>
-        </w:rPr>
-        <w:t>- Dari/Persian — Native, English — Fluent, Pashto — Intermediate</w:t>
-      </w:r>
-    </w:p>
+    <w:tbl>
+      <w:tblPr>
+        <w:tblW w:type="auto" w:w="0"/>
+        <w:tblLook w:firstColumn="1" w:firstRow="1" w:lastColumn="0" w:lastRow="0" w:noHBand="0" w:noVBand="1" w:val="04A0"/>
+      </w:tblPr>
+      <w:tblGrid>
+        <w:gridCol w:w="5429"/>
+        <w:gridCol w:w="5429"/>
+      </w:tblGrid>
+      <w:tr>
+        <w:tc>
+          <w:tcPr>
+            <w:tcW w:type="dxa" w:w="5429"/>
+            <w:shd w:fill="0B2D42"/>
+            <w:tcBorders>
+              <w:top w:val="single" w:sz="4" w:color="0B2D42"/>
+              <w:left w:val="single" w:sz="4" w:color="0B2D42"/>
+              <w:bottom w:val="single" w:sz="4" w:color="0B2D42"/>
+              <w:right w:val="single" w:sz="4" w:color="0B2D42"/>
+            </w:tcBorders>
+          </w:tcPr>
+          <w:p>
+            <w:r>
+              <w:rPr>
+                <w:b/>
+                <w:color w:val="FFFFFF"/>
+              </w:rPr>
+              <w:t>ALLAH YAR FROTAN</w:t>
+            </w:r>
+          </w:p>
+        </w:tc>
+        <w:tc>
+          <w:tcPr>
+            <w:tcW w:type="dxa" w:w="5429"/>
+            <w:shd w:fill="0B2D42"/>
+            <w:tcBorders>
+              <w:top w:val="single" w:sz="4" w:color="0B2D42"/>
+              <w:left w:val="single" w:sz="4" w:color="0B2D42"/>
+              <w:bottom w:val="single" w:sz="4" w:color="0B2D42"/>
+              <w:right w:val="single" w:sz="4" w:color="0B2D42"/>
+            </w:tcBorders>
+          </w:tcPr>
+          <w:p>
+            <w:pPr>
+              <w:jc w:val="right"/>
+            </w:pPr>
+            <w:r>
+              <w:rPr>
+                <w:color w:val="D8E9EF"/>
+              </w:rPr>
+              <w:t>Medical Officer — FMIC/HR/571</w:t>
+            </w:r>
+          </w:p>
+        </w:tc>
+      </w:tr>
+    </w:tbl>
+    <w:tbl>
+      <w:tblPr>
+        <w:tblW w:type="auto" w:w="0"/>
+        <w:tblLook w:firstColumn="1" w:firstRow="1" w:lastColumn="0" w:lastRow="0" w:noHBand="0" w:noVBand="1" w:val="04A0"/>
+      </w:tblPr>
+      <w:tblGrid>
+        <w:gridCol w:w="5429"/>
+        <w:gridCol w:w="5429"/>
+      </w:tblGrid>
+      <w:tr>
+        <w:tc>
+          <w:tcPr>
+            <w:tcW w:type="dxa" w:w="5429"/>
+            <w:shd w:fill="F3F8FA"/>
+            <w:tcBorders>
+              <w:top w:val="single" w:sz="4" w:color="F3F8FA"/>
+              <w:left w:val="single" w:sz="4" w:color="F3F8FA"/>
+              <w:bottom w:val="single" w:sz="4" w:color="F3F8FA"/>
+              <w:right w:val="single" w:sz="4" w:color="F3F8FA"/>
+            </w:tcBorders>
+          </w:tcPr>
+          <w:p/>
+          <w:p>
+            <w:pPr>
+              <w:pStyle w:val="Sec"/>
+            </w:pPr>
+            <w:r>
+              <w:t>EDUCATION &amp; CREDENTIALS</w:t>
+            </w:r>
+          </w:p>
+          <w:p>
+            <w:pPr>
+              <w:pStyle w:val="Body"/>
+            </w:pPr>
+            <w:r>
+              <w:t>EDUCATION</w:t>
+              <w:br/>
+              <w:t>MD, Curative Medicine</w:t>
+              <w:br/>
+              <w:t>Kabul Medical Science University | 2013–2020</w:t>
+            </w:r>
+          </w:p>
+          <w:p>
+            <w:pPr>
+              <w:pStyle w:val="Body"/>
+            </w:pPr>
+            <w:r>
+              <w:t>PROFESSIONAL REGISTRATION</w:t>
+              <w:br/>
+              <w:t>Verified medical professional registration/license</w:t>
+            </w:r>
+          </w:p>
+          <w:p>
+            <w:pPr>
+              <w:pStyle w:val="Body"/>
+            </w:pPr>
+            <w:r>
+              <w:t>MEDICAL EXIT EXAM</w:t>
+              <w:br/>
+              <w:t>Completed Medical Exit Exam</w:t>
+            </w:r>
+          </w:p>
+          <w:p>
+            <w:pPr>
+              <w:pStyle w:val="Sec"/>
+            </w:pPr>
+            <w:r>
+              <w:t>LANGUAGES</w:t>
+            </w:r>
+          </w:p>
+          <w:p>
+            <w:pPr>
+              <w:pStyle w:val="Body"/>
+              <w:ind w:left="202" w:hanging="144"/>
+            </w:pPr>
+            <w:r>
+              <w:t>• Dari/Persian — Native</w:t>
+            </w:r>
+          </w:p>
+          <w:p>
+            <w:pPr>
+              <w:pStyle w:val="Body"/>
+              <w:ind w:left="202" w:hanging="144"/>
+            </w:pPr>
+            <w:r>
+              <w:t>• English — Fluent</w:t>
+            </w:r>
+          </w:p>
+          <w:p>
+            <w:pPr>
+              <w:pStyle w:val="Body"/>
+              <w:ind w:left="202" w:hanging="144"/>
+            </w:pPr>
+            <w:r>
+              <w:t>• Pashto — Intermediate</w:t>
+            </w:r>
+          </w:p>
+        </w:tc>
+        <w:tc>
+          <w:tcPr>
+            <w:tcW w:type="dxa" w:w="5429"/>
+            <w:tcBorders>
+              <w:top w:val="single" w:sz="4" w:color="FFFFFF"/>
+              <w:left w:val="single" w:sz="4" w:color="FFFFFF"/>
+              <w:bottom w:val="single" w:sz="4" w:color="FFFFFF"/>
+              <w:right w:val="single" w:sz="4" w:color="FFFFFF"/>
+            </w:tcBorders>
+          </w:tcPr>
+          <w:p/>
+          <w:p>
+            <w:pPr>
+              <w:pStyle w:val="Sec"/>
+            </w:pPr>
+            <w:r>
+              <w:t>PROFESSIONAL EXPERIENCE CONTINUED</w:t>
+            </w:r>
+          </w:p>
+          <w:p>
+            <w:pPr>
+              <w:pStyle w:val="Meta"/>
+            </w:pPr>
+            <w:r>
+              <w:rPr>
+                <w:b/>
+              </w:rPr>
+              <w:t>Daikundi Governor's Office</w:t>
+            </w:r>
+          </w:p>
+          <w:p>
+            <w:pPr>
+              <w:pStyle w:val="Role"/>
+            </w:pPr>
+            <w:r>
+              <w:t>Public Relations &amp; Communications Advisor</w:t>
+            </w:r>
+          </w:p>
+          <w:p>
+            <w:pPr>
+              <w:pStyle w:val="Meta"/>
+            </w:pPr>
+            <w:r>
+              <w:t>Daikundi, Afghanistan | Dec 2020 – Aug 2021</w:t>
+            </w:r>
+          </w:p>
+          <w:p>
+            <w:pPr>
+              <w:pStyle w:val="Body"/>
+              <w:ind w:left="202" w:hanging="144"/>
+            </w:pPr>
+            <w:r>
+              <w:t>• Supported communication and coordination between provincial government departments, NGOs, communities, and development partners.</w:t>
+            </w:r>
+          </w:p>
+          <w:p>
+            <w:pPr>
+              <w:pStyle w:val="Meta"/>
+            </w:pPr>
+            <w:r>
+              <w:rPr>
+                <w:b/>
+              </w:rPr>
+              <w:t>Trend for a Better Tomorrow (TBT) – NGO</w:t>
+            </w:r>
+          </w:p>
+          <w:p>
+            <w:pPr>
+              <w:pStyle w:val="Role"/>
+            </w:pPr>
+            <w:r>
+              <w:t>Administrative and Finance Officer</w:t>
+            </w:r>
+          </w:p>
+          <w:p>
+            <w:pPr>
+              <w:pStyle w:val="Meta"/>
+            </w:pPr>
+            <w:r>
+              <w:t>Afghanistan | May 2019 – Sep 2019</w:t>
+            </w:r>
+          </w:p>
+          <w:p>
+            <w:pPr>
+              <w:pStyle w:val="Body"/>
+              <w:ind w:left="202" w:hanging="144"/>
+            </w:pPr>
+            <w:r>
+              <w:t>• Supported administrative operations, procurement processes, financial documentation, and program logistics.</w:t>
+            </w:r>
+          </w:p>
+          <w:p>
+            <w:pPr>
+              <w:pStyle w:val="Sec"/>
+            </w:pPr>
+            <w:r>
+              <w:t>CERTIFICATIONS &amp; TRAINING</w:t>
+            </w:r>
+          </w:p>
+          <w:p>
+            <w:pPr>
+              <w:pStyle w:val="Body"/>
+              <w:ind w:left="202" w:hanging="144"/>
+            </w:pPr>
+            <w:r>
+              <w:t>• Safeguarding &amp; PSEA — ACF (2024)</w:t>
+            </w:r>
+          </w:p>
+          <w:p>
+            <w:pPr>
+              <w:pStyle w:val="Body"/>
+              <w:ind w:left="202" w:hanging="144"/>
+            </w:pPr>
+            <w:r>
+              <w:t>• Infection Prevention &amp; Control (IPC) — ACF (2023)</w:t>
+            </w:r>
+          </w:p>
+          <w:p>
+            <w:pPr>
+              <w:pStyle w:val="Body"/>
+              <w:ind w:left="202" w:hanging="144"/>
+            </w:pPr>
+            <w:r>
+              <w:t>• HMIS Reporting &amp; Health Data Management — ACF (2023)</w:t>
+            </w:r>
+          </w:p>
+          <w:p>
+            <w:pPr>
+              <w:pStyle w:val="Body"/>
+              <w:ind w:left="202" w:hanging="144"/>
+            </w:pPr>
+            <w:r>
+              <w:t>• IMAM, IMNCI, IYCF &amp; Stock Management — ACF (2022)</w:t>
+            </w:r>
+          </w:p>
+          <w:p>
+            <w:pPr>
+              <w:pStyle w:val="Sec"/>
+            </w:pPr>
+            <w:r>
+              <w:t>VERIFIED EVIDENCE SNAPSHOT</w:t>
+            </w:r>
+          </w:p>
+          <w:p>
+            <w:pPr>
+              <w:pStyle w:val="Body"/>
+              <w:ind w:left="202" w:hanging="144"/>
+            </w:pPr>
+            <w:r>
+              <w:t>• TFU clinical assessment, diagnosis, treatment, and follow-up care for children with SAM.</w:t>
+            </w:r>
+          </w:p>
+          <w:p>
+            <w:pPr>
+              <w:pStyle w:val="Body"/>
+              <w:ind w:left="202" w:hanging="144"/>
+            </w:pPr>
+            <w:r>
+              <w:t>• Mobile health and nutrition team supervision in community-based BPHS/EPHS-related services.</w:t>
+            </w:r>
+          </w:p>
+          <w:p>
+            <w:pPr>
+              <w:pStyle w:val="Body"/>
+              <w:ind w:left="202" w:hanging="144"/>
+            </w:pPr>
+            <w:r>
+              <w:t>• HMIS records, DHIS2/HMIS data quality, and health reporting training.</w:t>
+            </w:r>
+          </w:p>
+          <w:p>
+            <w:pPr>
+              <w:pStyle w:val="Body"/>
+              <w:ind w:left="202" w:hanging="144"/>
+            </w:pPr>
+            <w:r>
+              <w:t>• MoPH, provincial health authority, NGO, community, and development-partner coordination.</w:t>
+            </w:r>
+          </w:p>
+          <w:p>
+            <w:pPr>
+              <w:pStyle w:val="Sec"/>
+            </w:pPr>
+            <w:r>
+              <w:t>DOCUMENT SCOPE</w:t>
+            </w:r>
+          </w:p>
+          <w:p>
+            <w:pPr>
+              <w:pStyle w:val="Body"/>
+            </w:pPr>
+            <w:r>
+              <w:t>Prepared for FMIC/HR/571 using verified profile evidence only.</w:t>
+            </w:r>
+          </w:p>
+        </w:tc>
+      </w:tr>
+    </w:tbl>
     <w:sectPr>
       <w:pgSz w:w="12240" w:h="15840"/>
-      <w:pgMar w:top="792" w:right="936" w:bottom="792" w:left="936" w:header="720" w:footer="720" w:gutter="0"/>
+      <w:pgMar w:top="605" w:right="691" w:bottom="648" w:left="691" w:header="720" w:footer="720" w:gutter="0"/>
       <w:cols w:space="720"/>
       <w:docGrid w:linePitch="360"/>
     </w:sectPr>
@@ -857,12 +1143,9 @@
     <w:name w:val="Normal"/>
     <w:qFormat/>
     <w:rsid w:val="00FC693F"/>
-    <w:pPr>
-      <w:spacing w:after="40"/>
-    </w:pPr>
     <w:rPr>
-      <w:rFonts w:ascii="Aptos" w:hAnsi="Aptos"/>
-      <w:sz w:val="17"/>
+      <w:rFonts w:ascii="Aptos" w:hAnsi="Aptos" w:eastAsia="Aptos"/>
+      <w:sz w:val="18"/>
     </w:rPr>
   </w:style>
   <w:style w:type="paragraph" w:styleId="Header">
@@ -924,11 +1207,11 @@
       <w:outlineLvl w:val="0"/>
     </w:pPr>
     <w:rPr>
-      <w:rFonts w:asciiTheme="majorHAnsi" w:eastAsiaTheme="majorEastAsia" w:hAnsiTheme="majorHAnsi" w:cstheme="majorBidi" w:ascii="Aptos Display" w:hAnsi="Aptos Display"/>
+      <w:rFonts w:asciiTheme="majorHAnsi" w:eastAsiaTheme="majorEastAsia" w:hAnsiTheme="majorHAnsi" w:cstheme="majorBidi"/>
       <w:b/>
       <w:bCs/>
       <w:color w:val="365F91" w:themeColor="accent1" w:themeShade="BF"/>
-      <w:sz w:val="36"/>
+      <w:sz w:val="28"/>
       <w:szCs w:val="28"/>
     </w:rPr>
   </w:style>
@@ -948,11 +1231,11 @@
       <w:outlineLvl w:val="1"/>
     </w:pPr>
     <w:rPr>
-      <w:rFonts w:asciiTheme="majorHAnsi" w:eastAsiaTheme="majorEastAsia" w:hAnsiTheme="majorHAnsi" w:cstheme="majorBidi" w:ascii="Aptos Display" w:hAnsi="Aptos Display"/>
+      <w:rFonts w:asciiTheme="majorHAnsi" w:eastAsiaTheme="majorEastAsia" w:hAnsiTheme="majorHAnsi" w:cstheme="majorBidi"/>
       <w:b/>
       <w:bCs/>
-      <w:color w:val="1F4E79"/>
-      <w:sz w:val="21"/>
+      <w:color w:val="4F81BD" w:themeColor="accent1"/>
+      <w:sz w:val="26"/>
       <w:szCs w:val="26"/>
     </w:rPr>
   </w:style>
@@ -972,11 +1255,10 @@
       <w:outlineLvl w:val="2"/>
     </w:pPr>
     <w:rPr>
-      <w:rFonts w:asciiTheme="majorHAnsi" w:eastAsiaTheme="majorEastAsia" w:hAnsiTheme="majorHAnsi" w:cstheme="majorBidi" w:ascii="Aptos" w:hAnsi="Aptos"/>
+      <w:rFonts w:asciiTheme="majorHAnsi" w:eastAsiaTheme="majorEastAsia" w:hAnsiTheme="majorHAnsi" w:cstheme="majorBidi"/>
       <w:b/>
       <w:bCs/>
       <w:color w:val="4F81BD" w:themeColor="accent1"/>
-      <w:sz w:val="20"/>
     </w:rPr>
   </w:style>
   <w:style w:type="paragraph" w:styleId="Heading4">
@@ -12547,6 +12829,78 @@
         <w:shd w:val="clear" w:color="auto" w:fill="FBCAA2" w:themeFill="accent6" w:themeFillTint="7F"/>
       </w:tcPr>
     </w:tblStylePr>
+  </w:style>
+  <w:style w:type="paragraph" w:customStyle="1" w:styleId="Head">
+    <w:name w:val="Head"/>
+    <w:pPr>
+      <w:spacing w:after="40"/>
+    </w:pPr>
+    <w:rPr>
+      <w:rFonts w:ascii="Aptos" w:hAnsi="Aptos" w:eastAsia="Aptos"/>
+      <w:b/>
+      <w:color w:val="FFFFFF"/>
+      <w:sz w:val="46"/>
+    </w:rPr>
+  </w:style>
+  <w:style w:type="paragraph" w:customStyle="1" w:styleId="Sub">
+    <w:name w:val="Sub"/>
+    <w:pPr>
+      <w:spacing w:after="40"/>
+    </w:pPr>
+    <w:rPr>
+      <w:rFonts w:ascii="Aptos" w:hAnsi="Aptos" w:eastAsia="Aptos"/>
+      <w:b w:val="0"/>
+      <w:color w:val="A8E6DF"/>
+      <w:sz w:val="21"/>
+    </w:rPr>
+  </w:style>
+  <w:style w:type="paragraph" w:customStyle="1" w:styleId="Sec">
+    <w:name w:val="Sec"/>
+    <w:pPr>
+      <w:spacing w:after="40"/>
+    </w:pPr>
+    <w:rPr>
+      <w:rFonts w:ascii="Aptos" w:hAnsi="Aptos" w:eastAsia="Aptos"/>
+      <w:b/>
+      <w:color w:val="0B2D42"/>
+      <w:sz w:val="21"/>
+    </w:rPr>
+  </w:style>
+  <w:style w:type="paragraph" w:customStyle="1" w:styleId="Role">
+    <w:name w:val="Role"/>
+    <w:pPr>
+      <w:spacing w:after="40"/>
+    </w:pPr>
+    <w:rPr>
+      <w:rFonts w:ascii="Aptos" w:hAnsi="Aptos" w:eastAsia="Aptos"/>
+      <w:b/>
+      <w:color w:val="0B2D42"/>
+      <w:sz w:val="19"/>
+    </w:rPr>
+  </w:style>
+  <w:style w:type="paragraph" w:customStyle="1" w:styleId="Meta">
+    <w:name w:val="Meta"/>
+    <w:pPr>
+      <w:spacing w:after="40"/>
+    </w:pPr>
+    <w:rPr>
+      <w:rFonts w:ascii="Aptos" w:hAnsi="Aptos" w:eastAsia="Aptos"/>
+      <w:b w:val="0"/>
+      <w:color w:val="5F6F7A"/>
+      <w:sz w:val="16"/>
+    </w:rPr>
+  </w:style>
+  <w:style w:type="paragraph" w:customStyle="1" w:styleId="Body">
+    <w:name w:val="Body"/>
+    <w:pPr>
+      <w:spacing w:after="40"/>
+    </w:pPr>
+    <w:rPr>
+      <w:rFonts w:ascii="Aptos" w:hAnsi="Aptos" w:eastAsia="Aptos"/>
+      <w:b w:val="0"/>
+      <w:color w:val="20262E"/>
+      <w:sz w:val="17"/>
+    </w:rPr>
   </w:style>
 </w:styles>
 </file>

</xml_diff>

<commit_message>
Refine FMIC HR571 editorial CV design
Co-authored-by: arena-agent <297053741+arena-agent@users.noreply.github.com>
</commit_message>
<xml_diff>
--- a/documents/live_market_test_2026-09-30/watch_aeb9c295fd34296adf_medical_officer_tailored_cv.docx
+++ b/documents/live_market_test_2026-09-30/watch_aeb9c295fd34296adf_medical_officer_tailored_cv.docx
@@ -2,124 +2,64 @@
 <file path=word/document.xml><?xml version="1.0" encoding="utf-8"?>
 <w:document xmlns:wpc="http://schemas.microsoft.com/office/word/2010/wordprocessingCanvas" xmlns:mo="http://schemas.microsoft.com/office/mac/office/2008/main" xmlns:mc="http://schemas.openxmlformats.org/markup-compatibility/2006" xmlns:mv="urn:schemas-microsoft-com:mac:vml" xmlns:o="urn:schemas-microsoft-com:office:office" xmlns:r="http://schemas.openxmlformats.org/officeDocument/2006/relationships" xmlns:m="http://schemas.openxmlformats.org/officeDocument/2006/math" xmlns:v="urn:schemas-microsoft-com:vml" xmlns:wp14="http://schemas.microsoft.com/office/word/2010/wordprocessingDrawing" xmlns:wp="http://schemas.openxmlformats.org/drawingml/2006/wordprocessingDrawing" xmlns:w10="urn:schemas-microsoft-com:office:word" xmlns:w="http://schemas.openxmlformats.org/wordprocessingml/2006/main" xmlns:w14="http://schemas.microsoft.com/office/word/2010/wordml" xmlns:wpg="http://schemas.microsoft.com/office/word/2010/wordprocessingGroup" xmlns:wpi="http://schemas.microsoft.com/office/word/2010/wordprocessingInk" xmlns:wne="http://schemas.microsoft.com/office/word/2006/wordml" xmlns:wps="http://schemas.microsoft.com/office/word/2010/wordprocessingShape" mc:Ignorable="w14 wp14">
   <w:body>
+    <w:p>
+      <w:pPr>
+        <w:pStyle w:val="Name"/>
+        <w:spacing w:after="0"/>
+      </w:pPr>
+      <w:r>
+        <w:t>ALLAH YAR FROTAN</w:t>
+      </w:r>
+    </w:p>
+    <w:p>
+      <w:pPr>
+        <w:pStyle w:val="Title"/>
+      </w:pPr>
+      <w:r>
+        <w:t>Medical Doctor | Health &amp; Nutrition Program Coordination</w:t>
+      </w:r>
+    </w:p>
+    <w:p>
+      <w:pPr>
+        <w:pStyle w:val="Contact"/>
+      </w:pPr>
+      <w:r>
+        <w:t>Kabul, Afghanistan | +93766462006 | alfrotan@gmail.com</w:t>
+      </w:r>
+    </w:p>
+    <w:p>
+      <w:pPr>
+        <w:pStyle w:val="Label"/>
+      </w:pPr>
+      <w:r>
+        <w:t xml:space="preserve">TARGET  </w:t>
+      </w:r>
+      <w:r>
+        <w:rPr>
+          <w:b/>
+        </w:rPr>
+        <w:t>Medical Officer — FMIC/HR/571 | French Medical Institute for Mothers and Children (FMIC), Kabul</w:t>
+      </w:r>
+    </w:p>
     <w:tbl>
       <w:tblPr>
         <w:tblW w:type="auto" w:w="0"/>
         <w:tblLook w:firstColumn="1" w:firstRow="1" w:lastColumn="0" w:lastRow="0" w:noHBand="0" w:noVBand="1" w:val="04A0"/>
       </w:tblPr>
       <w:tblGrid>
-        <w:gridCol w:w="10858"/>
+        <w:gridCol w:w="5328"/>
+        <w:gridCol w:w="5328"/>
       </w:tblGrid>
       <w:tr>
         <w:tc>
           <w:tcPr>
-            <w:tcW w:type="dxa" w:w="10858"/>
-            <w:shd w:fill="0B2D42"/>
-            <w:tcBorders>
-              <w:top w:val="single" w:sz="4" w:color="0B2D42"/>
-              <w:left w:val="single" w:sz="4" w:color="0B2D42"/>
-              <w:bottom w:val="single" w:sz="4" w:color="0B2D42"/>
-              <w:right w:val="single" w:sz="4" w:color="0B2D42"/>
-            </w:tcBorders>
+            <w:tcW w:type="dxa" w:w="5328"/>
+            <w:shd w:fill="F6F8F7"/>
           </w:tcPr>
           <w:p/>
           <w:p>
             <w:pPr>
-              <w:pStyle w:val="Head"/>
-              <w:jc w:val="center"/>
-            </w:pPr>
-            <w:r>
-              <w:t>ALLAH YAR FROTAN</w:t>
-            </w:r>
-          </w:p>
-          <w:p>
-            <w:pPr>
-              <w:pStyle w:val="Sub"/>
-              <w:jc w:val="center"/>
-            </w:pPr>
-            <w:r>
-              <w:t>Medical Doctor | Health &amp; Nutrition Program Coordination</w:t>
-            </w:r>
-          </w:p>
-          <w:p>
-            <w:pPr>
-              <w:pStyle w:val="Sub"/>
-              <w:jc w:val="center"/>
-            </w:pPr>
-            <w:r>
-              <w:t>Kabul, Afghanistan | +93766462006 | alfrotan@gmail.com</w:t>
-            </w:r>
-          </w:p>
-        </w:tc>
-      </w:tr>
-    </w:tbl>
-    <w:tbl>
-      <w:tblPr>
-        <w:tblW w:type="auto" w:w="0"/>
-        <w:tblLook w:firstColumn="1" w:firstRow="1" w:lastColumn="0" w:lastRow="0" w:noHBand="0" w:noVBand="1" w:val="04A0"/>
-      </w:tblPr>
-      <w:tblGrid>
-        <w:gridCol w:w="10858"/>
-      </w:tblGrid>
-      <w:tr>
-        <w:tc>
-          <w:tcPr>
-            <w:tcW w:type="dxa" w:w="10858"/>
-            <w:shd w:fill="F5F8FA"/>
-            <w:tcBorders>
-              <w:top w:val="single" w:sz="4" w:color="DDE8EE"/>
-              <w:left w:val="single" w:sz="4" w:color="DDE8EE"/>
-              <w:bottom w:val="single" w:sz="4" w:color="DDE8EE"/>
-              <w:right w:val="single" w:sz="4" w:color="DDE8EE"/>
-            </w:tcBorders>
-          </w:tcPr>
-          <w:p>
-            <w:pPr>
-              <w:jc w:val="center"/>
-            </w:pPr>
-            <w:r>
-              <w:rPr>
-                <w:b/>
-                <w:color w:val="0F766E"/>
-              </w:rPr>
-              <w:t xml:space="preserve">TARGET ROLE  </w:t>
-            </w:r>
-            <w:r>
-              <w:rPr>
-                <w:b/>
-                <w:color w:val="0B2D42"/>
-              </w:rPr>
-              <w:t>Medical Officer — FMIC/HR/571 | French Medical Institute for Mothers and Children (FMIC), Kabul</w:t>
-            </w:r>
-          </w:p>
-        </w:tc>
-      </w:tr>
-    </w:tbl>
-    <w:tbl>
-      <w:tblPr>
-        <w:tblW w:type="auto" w:w="0"/>
-        <w:tblLook w:firstColumn="1" w:firstRow="1" w:lastColumn="0" w:lastRow="0" w:noHBand="0" w:noVBand="1" w:val="04A0"/>
-      </w:tblPr>
-      <w:tblGrid>
-        <w:gridCol w:w="5429"/>
-        <w:gridCol w:w="5429"/>
-      </w:tblGrid>
-      <w:tr>
-        <w:tc>
-          <w:tcPr>
-            <w:tcW w:type="dxa" w:w="5429"/>
-            <w:shd w:fill="F3F8FA"/>
-            <w:tcBorders>
-              <w:top w:val="single" w:sz="4" w:color="F3F8FA"/>
-              <w:left w:val="single" w:sz="4" w:color="F3F8FA"/>
-              <w:bottom w:val="single" w:sz="4" w:color="F3F8FA"/>
-              <w:right w:val="single" w:sz="4" w:color="F3F8FA"/>
-            </w:tcBorders>
-          </w:tcPr>
-          <w:p/>
-          <w:p>
-            <w:pPr>
-              <w:pStyle w:val="Sec"/>
+              <w:pStyle w:val="Section"/>
             </w:pPr>
             <w:r>
               <w:t>CLINICAL &amp; PROFESSIONAL STRENGTHS</w:t>
@@ -199,7 +139,7 @@
           </w:p>
           <w:p>
             <w:pPr>
-              <w:pStyle w:val="Sec"/>
+              <w:pStyle w:val="Section"/>
             </w:pPr>
             <w:r>
               <w:t>VERIFIED MEDICAL BASIS</w:t>
@@ -235,18 +175,12 @@
         </w:tc>
         <w:tc>
           <w:tcPr>
-            <w:tcW w:type="dxa" w:w="5429"/>
-            <w:tcBorders>
-              <w:top w:val="single" w:sz="4" w:color="FFFFFF"/>
-              <w:left w:val="single" w:sz="4" w:color="FFFFFF"/>
-              <w:bottom w:val="single" w:sz="4" w:color="FFFFFF"/>
-              <w:right w:val="single" w:sz="4" w:color="FFFFFF"/>
-            </w:tcBorders>
+            <w:tcW w:type="dxa" w:w="5328"/>
           </w:tcPr>
           <w:p/>
           <w:p>
             <w:pPr>
-              <w:pStyle w:val="Sec"/>
+              <w:pStyle w:val="Section"/>
             </w:pPr>
             <w:r>
               <w:t>PROFESSIONAL PROFILE</w:t>
@@ -262,7 +196,7 @@
           </w:p>
           <w:p>
             <w:pPr>
-              <w:pStyle w:val="Sec"/>
+              <w:pStyle w:val="Section"/>
             </w:pPr>
             <w:r>
               <w:t>PROFESSIONAL EXPERIENCE</w:t>
@@ -270,12 +204,17 @@
           </w:p>
           <w:p>
             <w:pPr>
+              <w:pStyle w:val="Label"/>
+            </w:pPr>
+            <w:r>
+              <w:t>May 2023 – Jul 2025</w:t>
+            </w:r>
+          </w:p>
+          <w:p>
+            <w:pPr>
               <w:pStyle w:val="Meta"/>
             </w:pPr>
             <w:r>
-              <w:rPr>
-                <w:b/>
-              </w:rPr>
               <w:t>Action Against Hunger (ACF-International)</w:t>
             </w:r>
           </w:p>
@@ -292,7 +231,7 @@
               <w:pStyle w:val="Meta"/>
             </w:pPr>
             <w:r>
-              <w:t>Sang-e-Takht TFU, Daikundi | May 2023 – Jul 2025</w:t>
+              <w:t>Sang-e-Takht TFU, Daikundi</w:t>
             </w:r>
           </w:p>
           <w:p>
@@ -315,12 +254,17 @@
           </w:p>
           <w:p>
             <w:pPr>
+              <w:pStyle w:val="Label"/>
+            </w:pPr>
+            <w:r>
+              <w:t>Feb 2022 – Dec 2022</w:t>
+            </w:r>
+          </w:p>
+          <w:p>
+            <w:pPr>
               <w:pStyle w:val="Meta"/>
             </w:pPr>
             <w:r>
-              <w:rPr>
-                <w:b/>
-              </w:rPr>
               <w:t>Action Against Hunger (ACF-International)</w:t>
             </w:r>
           </w:p>
@@ -337,7 +281,7 @@
               <w:pStyle w:val="Meta"/>
             </w:pPr>
             <w:r>
-              <w:t>Gizab &amp; Sang-e-Takht, Daikundi | Feb 2022 – Dec 2022</w:t>
+              <w:t>Gizab &amp; Sang-e-Takht, Daikundi</w:t>
             </w:r>
           </w:p>
           <w:p>
@@ -360,12 +304,17 @@
           </w:p>
           <w:p>
             <w:pPr>
+              <w:pStyle w:val="Label"/>
+            </w:pPr>
+            <w:r>
+              <w:t>Oct 2020 – Dec 2020</w:t>
+            </w:r>
+          </w:p>
+          <w:p>
+            <w:pPr>
               <w:pStyle w:val="Meta"/>
             </w:pPr>
             <w:r>
-              <w:rPr>
-                <w:b/>
-              </w:rPr>
               <w:t>Daikundi Provincial Public Health Directorate</w:t>
             </w:r>
           </w:p>
@@ -382,7 +331,7 @@
               <w:pStyle w:val="Meta"/>
             </w:pPr>
             <w:r>
-              <w:t>Daikundi, Afghanistan | Oct 2020 – Dec 2020</w:t>
+              <w:t>Daikundi, Afghanistan</w:t>
             </w:r>
           </w:p>
           <w:p>
@@ -396,10 +345,10 @@
           </w:p>
           <w:p>
             <w:pPr>
-              <w:pStyle w:val="Sec"/>
+              <w:pStyle w:val="Section"/>
             </w:pPr>
             <w:r>
-              <w:t>FMIC APPLICATION FOCUS</w:t>
+              <w:t>APPLICATION FOCUS</w:t>
             </w:r>
           </w:p>
           <w:p>
@@ -407,7 +356,7 @@
               <w:pStyle w:val="Body"/>
             </w:pPr>
             <w:r>
-              <w:t>Tailored to Medical Officer vacancy FMIC/HR/571 using verified clinical, infection-prevention, HMIS, and health-program coordination evidence only.</w:t>
+              <w:t>Tailored to FMIC/HR/571 using verified clinical, infection-prevention, HMIS, and health-program coordination evidence only.</w:t>
             </w:r>
           </w:p>
         </w:tc>
@@ -418,127 +367,59 @@
         <w:br w:type="page"/>
       </w:r>
     </w:p>
+    <w:p>
+      <w:pPr>
+        <w:pStyle w:val="Section"/>
+      </w:pPr>
+      <w:r>
+        <w:t>ALLAH YAR FROTAN    Medical Officer — FMIC/HR/571</w:t>
+      </w:r>
+    </w:p>
     <w:tbl>
       <w:tblPr>
         <w:tblW w:type="auto" w:w="0"/>
         <w:tblLook w:firstColumn="1" w:firstRow="1" w:lastColumn="0" w:lastRow="0" w:noHBand="0" w:noVBand="1" w:val="04A0"/>
       </w:tblPr>
       <w:tblGrid>
-        <w:gridCol w:w="5429"/>
-        <w:gridCol w:w="5429"/>
+        <w:gridCol w:w="5328"/>
+        <w:gridCol w:w="5328"/>
       </w:tblGrid>
       <w:tr>
         <w:tc>
           <w:tcPr>
-            <w:tcW w:type="dxa" w:w="5429"/>
-            <w:shd w:fill="0B2D42"/>
-            <w:tcBorders>
-              <w:top w:val="single" w:sz="4" w:color="0B2D42"/>
-              <w:left w:val="single" w:sz="4" w:color="0B2D42"/>
-              <w:bottom w:val="single" w:sz="4" w:color="0B2D42"/>
-              <w:right w:val="single" w:sz="4" w:color="0B2D42"/>
-            </w:tcBorders>
-          </w:tcPr>
-          <w:p>
-            <w:r>
-              <w:rPr>
-                <w:b/>
-                <w:color w:val="FFFFFF"/>
-              </w:rPr>
-              <w:t>ALLAH YAR FROTAN</w:t>
-            </w:r>
-          </w:p>
-        </w:tc>
-        <w:tc>
-          <w:tcPr>
-            <w:tcW w:type="dxa" w:w="5429"/>
-            <w:shd w:fill="0B2D42"/>
-            <w:tcBorders>
-              <w:top w:val="single" w:sz="4" w:color="0B2D42"/>
-              <w:left w:val="single" w:sz="4" w:color="0B2D42"/>
-              <w:bottom w:val="single" w:sz="4" w:color="0B2D42"/>
-              <w:right w:val="single" w:sz="4" w:color="0B2D42"/>
-            </w:tcBorders>
-          </w:tcPr>
-          <w:p>
-            <w:pPr>
-              <w:jc w:val="right"/>
-            </w:pPr>
-            <w:r>
-              <w:rPr>
-                <w:color w:val="D8E9EF"/>
-              </w:rPr>
-              <w:t>Medical Officer — FMIC/HR/571</w:t>
-            </w:r>
-          </w:p>
-        </w:tc>
-      </w:tr>
-    </w:tbl>
-    <w:tbl>
-      <w:tblPr>
-        <w:tblW w:type="auto" w:w="0"/>
-        <w:tblLook w:firstColumn="1" w:firstRow="1" w:lastColumn="0" w:lastRow="0" w:noHBand="0" w:noVBand="1" w:val="04A0"/>
-      </w:tblPr>
-      <w:tblGrid>
-        <w:gridCol w:w="5429"/>
-        <w:gridCol w:w="5429"/>
-      </w:tblGrid>
-      <w:tr>
-        <w:tc>
-          <w:tcPr>
-            <w:tcW w:type="dxa" w:w="5429"/>
-            <w:shd w:fill="F3F8FA"/>
-            <w:tcBorders>
-              <w:top w:val="single" w:sz="4" w:color="F3F8FA"/>
-              <w:left w:val="single" w:sz="4" w:color="F3F8FA"/>
-              <w:bottom w:val="single" w:sz="4" w:color="F3F8FA"/>
-              <w:right w:val="single" w:sz="4" w:color="F3F8FA"/>
-            </w:tcBorders>
+            <w:tcW w:type="dxa" w:w="5328"/>
+            <w:shd w:fill="F6F8F7"/>
           </w:tcPr>
           <w:p/>
           <w:p>
             <w:pPr>
-              <w:pStyle w:val="Sec"/>
+              <w:pStyle w:val="Section"/>
             </w:pPr>
             <w:r>
-              <w:t>EDUCATION &amp; CREDENTIALS</w:t>
+              <w:t>ALLAH YAR FROTAN</w:t>
             </w:r>
           </w:p>
           <w:p>
             <w:pPr>
-              <w:pStyle w:val="Body"/>
+              <w:pStyle w:val="Title"/>
             </w:pPr>
             <w:r>
-              <w:t>EDUCATION</w:t>
-              <w:br/>
-              <w:t>MD, Curative Medicine</w:t>
-              <w:br/>
-              <w:t>Kabul Medical Science University | 2013–2020</w:t>
+              <w:t>Medical Doctor | Health &amp; Nutrition</w:t>
             </w:r>
           </w:p>
           <w:p>
             <w:pPr>
-              <w:pStyle w:val="Body"/>
+              <w:pStyle w:val="Contact"/>
             </w:pPr>
             <w:r>
-              <w:t>PROFESSIONAL REGISTRATION</w:t>
+              <w:t>+93766462006</w:t>
               <w:br/>
-              <w:t>Verified medical professional registration/license</w:t>
+              <w:t>alfrotan@gmail.com</w:t>
             </w:r>
           </w:p>
           <w:p>
             <w:pPr>
-              <w:pStyle w:val="Body"/>
-            </w:pPr>
-            <w:r>
-              <w:t>MEDICAL EXIT EXAM</w:t>
-              <w:br/>
-              <w:t>Completed Medical Exit Exam</w:t>
-            </w:r>
-          </w:p>
-          <w:p>
-            <w:pPr>
-              <w:pStyle w:val="Sec"/>
+              <w:pStyle w:val="Section"/>
             </w:pPr>
             <w:r>
               <w:t>LANGUAGES</w:t>
@@ -571,21 +452,50 @@
               <w:t>• Pashto — Intermediate</w:t>
             </w:r>
           </w:p>
+          <w:p>
+            <w:pPr>
+              <w:pStyle w:val="Section"/>
+            </w:pPr>
+            <w:r>
+              <w:t>VERIFIED MEDICAL BASIS</w:t>
+            </w:r>
+          </w:p>
+          <w:p>
+            <w:pPr>
+              <w:pStyle w:val="Body"/>
+              <w:ind w:left="202" w:hanging="144"/>
+            </w:pPr>
+            <w:r>
+              <w:t>• MD, Curative Medicine</w:t>
+            </w:r>
+          </w:p>
+          <w:p>
+            <w:pPr>
+              <w:pStyle w:val="Body"/>
+              <w:ind w:left="202" w:hanging="144"/>
+            </w:pPr>
+            <w:r>
+              <w:t>• Medical registration/license</w:t>
+            </w:r>
+          </w:p>
+          <w:p>
+            <w:pPr>
+              <w:pStyle w:val="Body"/>
+              <w:ind w:left="202" w:hanging="144"/>
+            </w:pPr>
+            <w:r>
+              <w:t>• Medical Exit Exam completed</w:t>
+            </w:r>
+          </w:p>
         </w:tc>
         <w:tc>
           <w:tcPr>
-            <w:tcW w:type="dxa" w:w="5429"/>
-            <w:tcBorders>
-              <w:top w:val="single" w:sz="4" w:color="FFFFFF"/>
-              <w:left w:val="single" w:sz="4" w:color="FFFFFF"/>
-              <w:bottom w:val="single" w:sz="4" w:color="FFFFFF"/>
-              <w:right w:val="single" w:sz="4" w:color="FFFFFF"/>
-            </w:tcBorders>
+            <w:tcW w:type="dxa" w:w="5328"/>
           </w:tcPr>
           <w:p/>
           <w:p>
             <w:pPr>
-              <w:pStyle w:val="Sec"/>
+              <w:pStyle w:val="Section"/>
             </w:pPr>
             <w:r>
               <w:t>PROFESSIONAL EXPERIENCE CONTINUED</w:t>
@@ -593,12 +503,17 @@
           </w:p>
           <w:p>
             <w:pPr>
+              <w:pStyle w:val="Label"/>
+            </w:pPr>
+            <w:r>
+              <w:t>Dec 2020 – Aug 2021</w:t>
+            </w:r>
+          </w:p>
+          <w:p>
+            <w:pPr>
               <w:pStyle w:val="Meta"/>
             </w:pPr>
             <w:r>
-              <w:rPr>
-                <w:b/>
-              </w:rPr>
               <w:t>Daikundi Governor's Office</w:t>
             </w:r>
           </w:p>
@@ -615,7 +530,7 @@
               <w:pStyle w:val="Meta"/>
             </w:pPr>
             <w:r>
-              <w:t>Daikundi, Afghanistan | Dec 2020 – Aug 2021</w:t>
+              <w:t>Daikundi, Afghanistan</w:t>
             </w:r>
           </w:p>
           <w:p>
@@ -629,12 +544,17 @@
           </w:p>
           <w:p>
             <w:pPr>
+              <w:pStyle w:val="Label"/>
+            </w:pPr>
+            <w:r>
+              <w:t>May 2019 – Sep 2019</w:t>
+            </w:r>
+          </w:p>
+          <w:p>
+            <w:pPr>
               <w:pStyle w:val="Meta"/>
             </w:pPr>
             <w:r>
-              <w:rPr>
-                <w:b/>
-              </w:rPr>
               <w:t>Trend for a Better Tomorrow (TBT) – NGO</w:t>
             </w:r>
           </w:p>
@@ -651,7 +571,7 @@
               <w:pStyle w:val="Meta"/>
             </w:pPr>
             <w:r>
-              <w:t>Afghanistan | May 2019 – Sep 2019</w:t>
+              <w:t>Afghanistan</w:t>
             </w:r>
           </w:p>
           <w:p>
@@ -665,7 +585,65 @@
           </w:p>
           <w:p>
             <w:pPr>
-              <w:pStyle w:val="Sec"/>
+              <w:pStyle w:val="Section"/>
+            </w:pPr>
+            <w:r>
+              <w:t>EDUCATION &amp; VERIFIED MEDICAL CREDENTIALS</w:t>
+            </w:r>
+          </w:p>
+          <w:p>
+            <w:pPr>
+              <w:pStyle w:val="Label"/>
+            </w:pPr>
+            <w:r>
+              <w:t>EDUCATION</w:t>
+            </w:r>
+          </w:p>
+          <w:p>
+            <w:pPr>
+              <w:pStyle w:val="Body"/>
+            </w:pPr>
+            <w:r>
+              <w:t>MD, Curative Medicine</w:t>
+              <w:br/>
+              <w:t>Kabul Medical Science University | 2013–2020</w:t>
+            </w:r>
+          </w:p>
+          <w:p>
+            <w:pPr>
+              <w:pStyle w:val="Label"/>
+            </w:pPr>
+            <w:r>
+              <w:t>PROFESSIONAL REGISTRATION</w:t>
+            </w:r>
+          </w:p>
+          <w:p>
+            <w:pPr>
+              <w:pStyle w:val="Body"/>
+            </w:pPr>
+            <w:r>
+              <w:t>Verified medical professional registration/license</w:t>
+            </w:r>
+          </w:p>
+          <w:p>
+            <w:pPr>
+              <w:pStyle w:val="Label"/>
+            </w:pPr>
+            <w:r>
+              <w:t>MEDICAL EXIT EXAM</w:t>
+            </w:r>
+          </w:p>
+          <w:p>
+            <w:pPr>
+              <w:pStyle w:val="Body"/>
+            </w:pPr>
+            <w:r>
+              <w:t>Completed Medical Exit Exam</w:t>
+            </w:r>
+          </w:p>
+          <w:p>
+            <w:pPr>
+              <w:pStyle w:val="Section"/>
             </w:pPr>
             <w:r>
               <w:t>CERTIFICATIONS &amp; TRAINING</w:t>
@@ -709,54 +687,10 @@
           </w:p>
           <w:p>
             <w:pPr>
-              <w:pStyle w:val="Sec"/>
+              <w:pStyle w:val="Section"/>
             </w:pPr>
             <w:r>
-              <w:t>VERIFIED EVIDENCE SNAPSHOT</w:t>
-            </w:r>
-          </w:p>
-          <w:p>
-            <w:pPr>
-              <w:pStyle w:val="Body"/>
-              <w:ind w:left="202" w:hanging="144"/>
-            </w:pPr>
-            <w:r>
-              <w:t>• TFU clinical assessment, diagnosis, treatment, and follow-up care for children with SAM.</w:t>
-            </w:r>
-          </w:p>
-          <w:p>
-            <w:pPr>
-              <w:pStyle w:val="Body"/>
-              <w:ind w:left="202" w:hanging="144"/>
-            </w:pPr>
-            <w:r>
-              <w:t>• Mobile health and nutrition team supervision in community-based BPHS/EPHS-related services.</w:t>
-            </w:r>
-          </w:p>
-          <w:p>
-            <w:pPr>
-              <w:pStyle w:val="Body"/>
-              <w:ind w:left="202" w:hanging="144"/>
-            </w:pPr>
-            <w:r>
-              <w:t>• HMIS records, DHIS2/HMIS data quality, and health reporting training.</w:t>
-            </w:r>
-          </w:p>
-          <w:p>
-            <w:pPr>
-              <w:pStyle w:val="Body"/>
-              <w:ind w:left="202" w:hanging="144"/>
-            </w:pPr>
-            <w:r>
-              <w:t>• MoPH, provincial health authority, NGO, community, and development-partner coordination.</w:t>
-            </w:r>
-          </w:p>
-          <w:p>
-            <w:pPr>
-              <w:pStyle w:val="Sec"/>
-            </w:pPr>
-            <w:r>
-              <w:t>DOCUMENT SCOPE</w:t>
+              <w:t>LANGUAGES</w:t>
             </w:r>
           </w:p>
           <w:p>
@@ -764,20 +698,39 @@
               <w:pStyle w:val="Body"/>
             </w:pPr>
             <w:r>
-              <w:t>Prepared for FMIC/HR/571 using verified profile evidence only.</w:t>
+              <w:t>Dari/Persian — Native | English — Fluent | Pashto — Intermediate</w:t>
             </w:r>
           </w:p>
         </w:tc>
       </w:tr>
     </w:tbl>
     <w:sectPr>
+      <w:footerReference w:type="default" r:id="rId9"/>
       <w:pgSz w:w="12240" w:h="15840"/>
-      <w:pgMar w:top="605" w:right="691" w:bottom="648" w:left="691" w:header="720" w:footer="720" w:gutter="0"/>
+      <w:pgMar w:top="648" w:right="792" w:bottom="648" w:left="792" w:header="720" w:footer="720" w:gutter="0"/>
       <w:cols w:space="720"/>
       <w:docGrid w:linePitch="360"/>
     </w:sectPr>
   </w:body>
 </w:document>
+</file>
+
+<file path=word/footer1.xml><?xml version="1.0" encoding="utf-8"?>
+<w:ftr xmlns:m="http://schemas.openxmlformats.org/officeDocument/2006/math" xmlns:mc="http://schemas.openxmlformats.org/markup-compatibility/2006" xmlns:mo="http://schemas.microsoft.com/office/mac/office/2008/main" xmlns:mv="urn:schemas-microsoft-com:mac:vml" xmlns:o="urn:schemas-microsoft-com:office:office" xmlns:r="http://schemas.openxmlformats.org/officeDocument/2006/relationships" xmlns:v="urn:schemas-microsoft-com:vml" xmlns:w10="urn:schemas-microsoft-com:office:word" xmlns:w14="http://schemas.microsoft.com/office/word/2010/wordml" xmlns:w="http://schemas.openxmlformats.org/wordprocessingml/2006/main" xmlns:wne="http://schemas.microsoft.com/office/word/2006/wordml" xmlns:wp14="http://schemas.microsoft.com/office/word/2010/wordprocessingDrawing" xmlns:wp="http://schemas.openxmlformats.org/drawingml/2006/wordprocessingDrawing" xmlns:wpc="http://schemas.microsoft.com/office/word/2010/wordprocessingCanvas" xmlns:wpg="http://schemas.microsoft.com/office/word/2010/wordprocessingGroup" xmlns:wpi="http://schemas.microsoft.com/office/word/2010/wordprocessingInk" xmlns:wps="http://schemas.microsoft.com/office/word/2010/wordprocessingShape" mc:Ignorable="w14 wp14">
+  <w:p>
+    <w:pPr>
+      <w:pStyle w:val="Footer"/>
+      <w:jc w:val="center"/>
+    </w:pPr>
+    <w:r>
+      <w:rPr>
+        <w:color w:val="66737A"/>
+        <w:sz w:val="14"/>
+      </w:rPr>
+      <w:t>Allah Yar Frotan — Medical Officer (FMIC/HR/571)</w:t>
+    </w:r>
+  </w:p>
+</w:ftr>
 </file>
 
 <file path=word/numbering.xml><?xml version="1.0" encoding="utf-8"?>
@@ -1145,7 +1098,7 @@
     <w:rsid w:val="00FC693F"/>
     <w:rPr>
       <w:rFonts w:ascii="Aptos" w:hAnsi="Aptos" w:eastAsia="Aptos"/>
-      <w:sz w:val="18"/>
+      <w:sz w:val="17"/>
     </w:rPr>
   </w:style>
   <w:style w:type="paragraph" w:styleId="Header">
@@ -1492,15 +1445,16 @@
       <w:pBdr>
         <w:bottom w:val="single" w:sz="8" w:space="4" w:color="4F81BD" w:themeColor="accent1"/>
       </w:pBdr>
-      <w:spacing w:after="300" w:line="240" w:lineRule="auto"/>
+      <w:spacing w:after="40" w:line="240" w:lineRule="auto"/>
       <w:contextualSpacing/>
     </w:pPr>
     <w:rPr>
-      <w:rFonts w:asciiTheme="majorHAnsi" w:eastAsiaTheme="majorEastAsia" w:hAnsiTheme="majorHAnsi" w:cstheme="majorBidi"/>
-      <w:color w:val="17365D" w:themeColor="text2" w:themeShade="BF"/>
+      <w:rFonts w:asciiTheme="majorHAnsi" w:eastAsiaTheme="majorEastAsia" w:hAnsiTheme="majorHAnsi" w:cstheme="majorBidi" w:ascii="Aptos" w:hAnsi="Aptos" w:eastAsia="Aptos"/>
+      <w:b w:val="0"/>
+      <w:color w:val="157C78"/>
       <w:spacing w:val="5"/>
       <w:kern w:val="28"/>
-      <w:sz w:val="52"/>
+      <w:sz w:val="21"/>
       <w:szCs w:val="52"/>
     </w:rPr>
   </w:style>
@@ -12830,76 +12784,88 @@
       </w:tcPr>
     </w:tblStylePr>
   </w:style>
-  <w:style w:type="paragraph" w:customStyle="1" w:styleId="Head">
-    <w:name w:val="Head"/>
+  <w:style w:type="paragraph" w:customStyle="1" w:styleId="Name">
+    <w:name w:val="Name"/>
+    <w:pPr>
+      <w:spacing w:after="40"/>
+    </w:pPr>
+    <w:rPr>
+      <w:rFonts w:ascii="Georgia" w:hAnsi="Georgia" w:eastAsia="Georgia"/>
+      <w:b/>
+      <w:color w:val="0C3442"/>
+      <w:sz w:val="48"/>
+    </w:rPr>
+  </w:style>
+  <w:style w:type="paragraph" w:customStyle="1" w:styleId="Contact">
+    <w:name w:val="Contact"/>
+    <w:pPr>
+      <w:spacing w:after="40"/>
+    </w:pPr>
+    <w:rPr>
+      <w:rFonts w:ascii="Aptos" w:hAnsi="Aptos" w:eastAsia="Aptos"/>
+      <w:b w:val="0"/>
+      <w:color w:val="66737A"/>
+      <w:sz w:val="16"/>
+    </w:rPr>
+  </w:style>
+  <w:style w:type="paragraph" w:customStyle="1" w:styleId="Section">
+    <w:name w:val="Section"/>
     <w:pPr>
       <w:spacing w:after="40"/>
     </w:pPr>
     <w:rPr>
       <w:rFonts w:ascii="Aptos" w:hAnsi="Aptos" w:eastAsia="Aptos"/>
       <w:b/>
-      <w:color w:val="FFFFFF"/>
-      <w:sz w:val="46"/>
+      <w:color w:val="0C3442"/>
+      <w:sz w:val="20"/>
     </w:rPr>
   </w:style>
-  <w:style w:type="paragraph" w:customStyle="1" w:styleId="Sub">
-    <w:name w:val="Sub"/>
+  <w:style w:type="paragraph" w:customStyle="1" w:styleId="Label">
+    <w:name w:val="Label"/>
+    <w:pPr>
+      <w:spacing w:after="40"/>
+    </w:pPr>
+    <w:rPr>
+      <w:rFonts w:ascii="Aptos" w:hAnsi="Aptos" w:eastAsia="Aptos"/>
+      <w:b/>
+      <w:color w:val="A88449"/>
+      <w:sz w:val="13"/>
+    </w:rPr>
+  </w:style>
+  <w:style w:type="paragraph" w:customStyle="1" w:styleId="Role">
+    <w:name w:val="Role"/>
+    <w:pPr>
+      <w:spacing w:after="40"/>
+    </w:pPr>
+    <w:rPr>
+      <w:rFonts w:ascii="Georgia" w:hAnsi="Georgia" w:eastAsia="Georgia"/>
+      <w:b/>
+      <w:color w:val="0C3442"/>
+      <w:sz w:val="20"/>
+    </w:rPr>
+  </w:style>
+  <w:style w:type="paragraph" w:customStyle="1" w:styleId="Meta">
+    <w:name w:val="Meta"/>
     <w:pPr>
       <w:spacing w:after="40"/>
     </w:pPr>
     <w:rPr>
       <w:rFonts w:ascii="Aptos" w:hAnsi="Aptos" w:eastAsia="Aptos"/>
       <w:b w:val="0"/>
-      <w:color w:val="A8E6DF"/>
-      <w:sz w:val="21"/>
+      <w:color w:val="66737A"/>
+      <w:sz w:val="15"/>
     </w:rPr>
   </w:style>
-  <w:style w:type="paragraph" w:customStyle="1" w:styleId="Sec">
-    <w:name w:val="Sec"/>
-    <w:pPr>
-      <w:spacing w:after="40"/>
-    </w:pPr>
-    <w:rPr>
-      <w:rFonts w:ascii="Aptos" w:hAnsi="Aptos" w:eastAsia="Aptos"/>
-      <w:b/>
-      <w:color w:val="0B2D42"/>
-      <w:sz w:val="21"/>
-    </w:rPr>
-  </w:style>
-  <w:style w:type="paragraph" w:customStyle="1" w:styleId="Role">
-    <w:name w:val="Role"/>
-    <w:pPr>
-      <w:spacing w:after="40"/>
-    </w:pPr>
-    <w:rPr>
-      <w:rFonts w:ascii="Aptos" w:hAnsi="Aptos" w:eastAsia="Aptos"/>
-      <w:b/>
-      <w:color w:val="0B2D42"/>
-      <w:sz w:val="19"/>
-    </w:rPr>
-  </w:style>
-  <w:style w:type="paragraph" w:customStyle="1" w:styleId="Meta">
-    <w:name w:val="Meta"/>
+  <w:style w:type="paragraph" w:customStyle="1" w:styleId="Body">
+    <w:name w:val="Body"/>
     <w:pPr>
       <w:spacing w:after="40"/>
     </w:pPr>
     <w:rPr>
       <w:rFonts w:ascii="Aptos" w:hAnsi="Aptos" w:eastAsia="Aptos"/>
       <w:b w:val="0"/>
-      <w:color w:val="5F6F7A"/>
+      <w:color w:val="172A35"/>
       <w:sz w:val="16"/>
-    </w:rPr>
-  </w:style>
-  <w:style w:type="paragraph" w:customStyle="1" w:styleId="Body">
-    <w:name w:val="Body"/>
-    <w:pPr>
-      <w:spacing w:after="40"/>
-    </w:pPr>
-    <w:rPr>
-      <w:rFonts w:ascii="Aptos" w:hAnsi="Aptos" w:eastAsia="Aptos"/>
-      <w:b w:val="0"/>
-      <w:color w:val="20262E"/>
-      <w:sz w:val="17"/>
     </w:rPr>
   </w:style>
 </w:styles>

</xml_diff>